<commit_message>
vault backup: 2026-07-08 15:40:04
</commit_message>
<xml_diff>
--- a/Investigare/png notevoli/Scheda_PNG_02_Yamada_Tetsuo.docx
+++ b/Investigare/png notevoli/Scheda_PNG_02_Yamada_Tetsuo.docx
@@ -15,7 +15,7 @@
           <w:color w:val="B49650"/>
           <w:sz w:val="14"/>
         </w:rPr>
-        <w:t>限界  ·  GENKAI v1.2  ·  限界</w:t>
+        <w:t>限界  ·  GENKAI v1.3  ·  限界</w:t>
       </w:r>
     </w:p>
     <w:p>
@@ -788,7 +788,7 @@
           <w:color w:val="787878"/>
           <w:sz w:val="16"/>
         </w:rPr>
-        <w:t>base 4 × 6 = 24  +  12 punti  +  3 bonus (d6)  =  39 totale</w:t>
+        <w:t>distribuzione: metodo diretto — il GM assegna i valori che servono al ruolo</w:t>
       </w:r>
     </w:p>
     <w:p>

</xml_diff>